<commit_message>
Delete ~$oposal (1) (1) (1) (1).docx
</commit_message>
<xml_diff>
--- a/docs/Proposal (1) (1) (1) (1).docx
+++ b/docs/Proposal (1) (1) (1) (1).docx
@@ -446,6 +446,33 @@
           <w:cs/>
         </w:rPr>
         <w:t>ครูพนิกาญจน์ เกตุแก้ว</w:t>
+      </w:r>
+    </w:p>
+    <w:p>
+      <w:pPr>
+        <w:rPr>
+          <w:rFonts w:ascii="TH Sarabun New" w:hAnsi="TH Sarabun New" w:cs="TH Sarabun New" w:hint="cs"/>
+          <w:sz w:val="32"/>
+          <w:szCs w:val="32"/>
+          <w:cs/>
+        </w:rPr>
+      </w:pPr>
+      <w:r>
+        <w:rPr>
+          <w:rFonts w:ascii="TH Sarabun New" w:hAnsi="TH Sarabun New" w:cs="TH Sarabun New"/>
+          <w:sz w:val="32"/>
+          <w:szCs w:val="32"/>
+        </w:rPr>
+        <w:tab/>
+      </w:r>
+      <w:r>
+        <w:rPr>
+          <w:rFonts w:ascii="TH Sarabun New" w:hAnsi="TH Sarabun New" w:cs="TH Sarabun New" w:hint="cs"/>
+          <w:sz w:val="32"/>
+          <w:szCs w:val="32"/>
+          <w:cs/>
+        </w:rPr>
+        <w:t>ครูกมลชนก ทันสมัย</w:t>
       </w:r>
     </w:p>
     <w:p>
@@ -773,6 +800,7 @@
           <w:szCs w:val="32"/>
           <w:cs/>
         </w:rPr>
+        <w:lastRenderedPageBreak/>
         <w:t>จาก</w:t>
       </w:r>
       <w:sdt>
@@ -1279,17 +1307,7 @@
           <w:szCs w:val="32"/>
           <w:cs/>
         </w:rPr>
-        <w:t>มีคุณสมบัติที่จะนำมาใช้ทำวัสดุซับเสียง จึงเลือกใช้วัสดุ</w:t>
-      </w:r>
-      <w:r>
-        <w:rPr>
-          <w:rFonts w:ascii="TH Sarabun New" w:hAnsi="TH Sarabun New" w:cs="TH Sarabun New"/>
-          <w:sz w:val="32"/>
-          <w:szCs w:val="32"/>
-          <w:cs/>
-        </w:rPr>
-        <w:lastRenderedPageBreak/>
-        <w:t xml:space="preserve">ประเภท </w:t>
+        <w:t xml:space="preserve">มีคุณสมบัติที่จะนำมาใช้ทำวัสดุซับเสียง จึงเลือกใช้วัสดุประเภท </w:t>
       </w:r>
       <w:r>
         <w:rPr>
@@ -3427,6 +3445,15 @@
       </w:r>
       <w:r>
         <w:rPr>
+          <w:rFonts w:ascii="TH Sarabun New" w:hAnsi="TH Sarabun New" w:cs="TH Sarabun New" w:hint="cs"/>
+          <w:sz w:val="32"/>
+          <w:szCs w:val="32"/>
+          <w:cs/>
+        </w:rPr>
+        <w:t xml:space="preserve"> </w:t>
+      </w:r>
+      <w:r>
+        <w:rPr>
           <w:rFonts w:ascii="TH Sarabun New" w:hAnsi="TH Sarabun New" w:cs="TH Sarabun New"/>
           <w:sz w:val="32"/>
           <w:szCs w:val="32"/>
@@ -7877,7 +7904,7 @@
             <w:pPr>
               <w:jc w:val="center"/>
               <w:rPr>
-                <w:rFonts w:ascii="TH Sarabun New" w:hAnsi="TH Sarabun New" w:cs="TH Sarabun New" w:hint="cs"/>
+                <w:rFonts w:ascii="TH Sarabun New" w:hAnsi="TH Sarabun New" w:cs="TH Sarabun New"/>
                 <w:b/>
                 <w:bCs/>
                 <w:sz w:val="32"/>
@@ -13067,6 +13094,7 @@
   <w:style w:type="character" w:default="1" w:styleId="DefaultParagraphFont">
     <w:name w:val="Default Paragraph Font"/>
     <w:uiPriority w:val="1"/>
+    <w:semiHidden/>
     <w:unhideWhenUsed/>
   </w:style>
   <w:style w:type="table" w:default="1" w:styleId="TableNormal">

</xml_diff>